<commit_message>
add inception conversion script
</commit_message>
<xml_diff>
--- a/Submission/Deklarationsskabelon_DANSK_040625.docx
+++ b/Submission/Deklarationsskabelon_DANSK_040625.docx
@@ -2529,24 +2529,6 @@
           </w:tcPr>
           <w:p>
             <w:pPr>
-              <w:autoSpaceDE w:val="0"/>
-              <w:autoSpaceDN w:val="0"/>
-              <w:spacing w:line="360" w:lineRule="auto"/>
-              <w:rPr>
-                <w:rFonts w:cstheme="minorHAnsi"/>
-                <w:color w:val="000000"/>
-              </w:rPr>
-            </w:pPr>
-          </w:p>
-        </w:tc>
-      </w:tr>
-      <w:tr>
-        <w:tc>
-          <w:tcPr>
-            <w:tcW w:w="5000" w:type="pct"/>
-          </w:tcPr>
-          <w:p>
-            <w:pPr>
               <w:tabs>
                 <w:tab w:val="left" w:pos="310"/>
               </w:tabs>
@@ -2941,14 +2923,6 @@
             <w:pPr>
               <w:rPr>
                 <w:rFonts w:cstheme="minorHAnsi"/>
-                <w:color w:val="333333"/>
-              </w:rPr>
-            </w:pPr>
-          </w:p>
-          <w:p>
-            <w:pPr>
-              <w:rPr>
-                <w:rFonts w:cstheme="minorHAnsi"/>
                 <w:b/>
                 <w:bCs/>
                 <w:color w:val="333333"/>
@@ -3765,16 +3739,7 @@
                 <w:sz w:val="22"/>
                 <w:szCs w:val="22"/>
               </w:rPr>
-              <w:t xml:space="preserve"> services, listet nedenfor</w:t>
-            </w:r>
-            <w:r>
-              <w:rPr>
-                <w:rFonts w:cstheme="minorHAnsi"/>
-                <w:color w:val="333333"/>
-                <w:sz w:val="22"/>
-                <w:szCs w:val="22"/>
-              </w:rPr>
-              <w:t xml:space="preserve">, eftersom integrationen af TensorFlow.js i et </w:t>
+              <w:t xml:space="preserve"> services, listet nedenfor, eftersom integrationen af TensorFlow.js i et </w:t>
             </w:r>
             <w:proofErr w:type="spellStart"/>
             <w:r>
@@ -3903,25 +3868,7 @@
                 <w:sz w:val="22"/>
                 <w:szCs w:val="22"/>
               </w:rPr>
-              <w:t xml:space="preserve">Filer udviklet med </w:t>
-            </w:r>
-            <w:r>
-              <w:rPr>
-                <w:rFonts w:cstheme="minorHAnsi"/>
-                <w:color w:val="333333"/>
-                <w:sz w:val="22"/>
-                <w:szCs w:val="22"/>
-              </w:rPr>
-              <w:t xml:space="preserve">førnævnt </w:t>
-            </w:r>
-            <w:r>
-              <w:rPr>
-                <w:rFonts w:cstheme="minorHAnsi"/>
-                <w:color w:val="333333"/>
-                <w:sz w:val="22"/>
-                <w:szCs w:val="22"/>
-              </w:rPr>
-              <w:t>pair-</w:t>
+              <w:t>Filer udviklet med førnævnt pair-</w:t>
             </w:r>
             <w:proofErr w:type="spellStart"/>
             <w:r>
@@ -3973,6 +3920,8 @@
               <w:rPr>
                 <w:i/>
                 <w:iCs/>
+                <w:sz w:val="22"/>
+                <w:szCs w:val="22"/>
               </w:rPr>
               <w:t>\</w:t>
             </w:r>
@@ -4350,32 +4299,235 @@
           <w:p>
             <w:pPr>
               <w:pStyle w:val="Listeafsnit"/>
+              <w:numPr>
+                <w:ilvl w:val="0"/>
+                <w:numId w:val="21"/>
+              </w:numPr>
               <w:spacing w:line="240" w:lineRule="atLeast"/>
               <w:rPr>
                 <w:rFonts w:cstheme="minorHAnsi"/>
                 <w:color w:val="333333"/>
                 <w:sz w:val="22"/>
                 <w:szCs w:val="22"/>
+                <w:lang w:val="da-DK"/>
               </w:rPr>
             </w:pPr>
+            <w:r>
+              <w:rPr>
+                <w:rFonts w:cstheme="minorHAnsi"/>
+                <w:i/>
+                <w:iCs/>
+                <w:color w:val="333333"/>
+                <w:sz w:val="22"/>
+                <w:szCs w:val="22"/>
+              </w:rPr>
+              <w:t>“\</w:t>
+            </w:r>
+            <w:proofErr w:type="spellStart"/>
+            <w:r>
+              <w:rPr>
+                <w:rFonts w:cstheme="minorHAnsi"/>
+                <w:i/>
+                <w:iCs/>
+                <w:color w:val="333333"/>
+                <w:sz w:val="22"/>
+                <w:szCs w:val="22"/>
+              </w:rPr>
+              <w:t>SpisNemt_FE</w:t>
+            </w:r>
+            <w:proofErr w:type="spellEnd"/>
+            <w:r>
+              <w:rPr>
+                <w:rFonts w:cstheme="minorHAnsi"/>
+                <w:i/>
+                <w:iCs/>
+                <w:color w:val="333333"/>
+                <w:sz w:val="22"/>
+                <w:szCs w:val="22"/>
+              </w:rPr>
+              <w:t>\</w:t>
+            </w:r>
+            <w:proofErr w:type="spellStart"/>
+            <w:r>
+              <w:rPr>
+                <w:rFonts w:cstheme="minorHAnsi"/>
+                <w:i/>
+                <w:iCs/>
+                <w:color w:val="333333"/>
+                <w:sz w:val="22"/>
+                <w:szCs w:val="22"/>
+              </w:rPr>
+              <w:t>src</w:t>
+            </w:r>
+            <w:proofErr w:type="spellEnd"/>
+            <w:r>
+              <w:rPr>
+                <w:rFonts w:cstheme="minorHAnsi"/>
+                <w:i/>
+                <w:iCs/>
+                <w:color w:val="333333"/>
+                <w:sz w:val="22"/>
+                <w:szCs w:val="22"/>
+              </w:rPr>
+              <w:t>\services\utils\</w:t>
+            </w:r>
+            <w:proofErr w:type="spellStart"/>
+            <w:r>
+              <w:rPr>
+                <w:rFonts w:cstheme="minorHAnsi"/>
+                <w:i/>
+                <w:iCs/>
+                <w:color w:val="333333"/>
+                <w:sz w:val="22"/>
+                <w:szCs w:val="22"/>
+              </w:rPr>
+              <w:t>mealHelpers.ts</w:t>
+            </w:r>
+            <w:proofErr w:type="spellEnd"/>
+            <w:r>
+              <w:rPr>
+                <w:rFonts w:cstheme="minorHAnsi"/>
+                <w:i/>
+                <w:iCs/>
+                <w:color w:val="333333"/>
+                <w:sz w:val="22"/>
+                <w:szCs w:val="22"/>
+              </w:rPr>
+              <w:t>”</w:t>
+            </w:r>
           </w:p>
-        </w:tc>
-      </w:tr>
-      <w:tr>
-        <w:trPr>
-          <w:trHeight w:val="12926"/>
-        </w:trPr>
-        <w:tc>
-          <w:tcPr>
-            <w:tcW w:w="5000" w:type="pct"/>
-          </w:tcPr>
           <w:p>
             <w:pPr>
-              <w:rPr>
-                <w:rFonts w:cstheme="minorHAnsi"/>
-                <w:color w:val="333333"/>
+              <w:pStyle w:val="Listeafsnit"/>
+              <w:numPr>
+                <w:ilvl w:val="0"/>
+                <w:numId w:val="21"/>
+              </w:numPr>
+              <w:spacing w:line="240" w:lineRule="atLeast"/>
+              <w:rPr>
+                <w:rFonts w:cstheme="minorHAnsi"/>
+                <w:color w:val="333333"/>
+                <w:sz w:val="22"/>
+                <w:szCs w:val="22"/>
+                <w:lang w:val="da-DK"/>
               </w:rPr>
             </w:pPr>
+            <w:r>
+              <w:rPr>
+                <w:rFonts w:cstheme="minorHAnsi"/>
+                <w:i/>
+                <w:iCs/>
+                <w:color w:val="333333"/>
+                <w:sz w:val="22"/>
+                <w:szCs w:val="22"/>
+                <w:lang w:val="da-DK"/>
+              </w:rPr>
+              <w:t>“\</w:t>
+            </w:r>
+            <w:proofErr w:type="spellStart"/>
+            <w:r>
+              <w:rPr>
+                <w:rFonts w:cstheme="minorHAnsi"/>
+                <w:i/>
+                <w:iCs/>
+                <w:color w:val="333333"/>
+                <w:sz w:val="22"/>
+                <w:szCs w:val="22"/>
+                <w:lang w:val="da-DK"/>
+              </w:rPr>
+              <w:t>SpisNemt_FE</w:t>
+            </w:r>
+            <w:proofErr w:type="spellEnd"/>
+            <w:r>
+              <w:rPr>
+                <w:rFonts w:cstheme="minorHAnsi"/>
+                <w:i/>
+                <w:iCs/>
+                <w:color w:val="333333"/>
+                <w:sz w:val="22"/>
+                <w:szCs w:val="22"/>
+                <w:lang w:val="da-DK"/>
+              </w:rPr>
+              <w:t>\</w:t>
+            </w:r>
+            <w:proofErr w:type="spellStart"/>
+            <w:r>
+              <w:rPr>
+                <w:rFonts w:cstheme="minorHAnsi"/>
+                <w:i/>
+                <w:iCs/>
+                <w:color w:val="333333"/>
+                <w:sz w:val="22"/>
+                <w:szCs w:val="22"/>
+                <w:lang w:val="da-DK"/>
+              </w:rPr>
+              <w:t>src</w:t>
+            </w:r>
+            <w:proofErr w:type="spellEnd"/>
+            <w:r>
+              <w:rPr>
+                <w:rFonts w:cstheme="minorHAnsi"/>
+                <w:i/>
+                <w:iCs/>
+                <w:color w:val="333333"/>
+                <w:sz w:val="22"/>
+                <w:szCs w:val="22"/>
+                <w:lang w:val="da-DK"/>
+              </w:rPr>
+              <w:t>\</w:t>
+            </w:r>
+            <w:proofErr w:type="spellStart"/>
+            <w:r>
+              <w:rPr>
+                <w:rFonts w:cstheme="minorHAnsi"/>
+                <w:i/>
+                <w:iCs/>
+                <w:color w:val="333333"/>
+                <w:sz w:val="22"/>
+                <w:szCs w:val="22"/>
+                <w:lang w:val="da-DK"/>
+              </w:rPr>
+              <w:t>utils</w:t>
+            </w:r>
+            <w:proofErr w:type="spellEnd"/>
+            <w:r>
+              <w:rPr>
+                <w:rFonts w:cstheme="minorHAnsi"/>
+                <w:i/>
+                <w:iCs/>
+                <w:color w:val="333333"/>
+                <w:sz w:val="22"/>
+                <w:szCs w:val="22"/>
+                <w:lang w:val="da-DK"/>
+              </w:rPr>
+              <w:t>\</w:t>
+            </w:r>
+            <w:proofErr w:type="spellStart"/>
+            <w:r>
+              <w:rPr>
+                <w:rFonts w:cstheme="minorHAnsi"/>
+                <w:i/>
+                <w:iCs/>
+                <w:color w:val="333333"/>
+                <w:sz w:val="22"/>
+                <w:szCs w:val="22"/>
+                <w:lang w:val="da-DK"/>
+              </w:rPr>
+              <w:t>asyncUtils.ts</w:t>
+            </w:r>
+            <w:proofErr w:type="spellEnd"/>
+            <w:r>
+              <w:rPr>
+                <w:rFonts w:cstheme="minorHAnsi"/>
+                <w:i/>
+                <w:iCs/>
+                <w:color w:val="333333"/>
+                <w:sz w:val="22"/>
+                <w:szCs w:val="22"/>
+                <w:lang w:val="da-DK"/>
+              </w:rPr>
+              <w:t>”</w:t>
+            </w:r>
           </w:p>
         </w:tc>
       </w:tr>
@@ -4948,7 +5100,7 @@
         <w:noProof/>
         <w:vanish/>
       </w:rPr>
-      <w:t>3</w:t>
+      <w:t>2</w:t>
     </w:r>
     <w:r>
       <w:rPr>
@@ -12782,17 +12934,6 @@
 </file>
 
 <file path=customXml/item1.xml><?xml version="1.0" encoding="utf-8"?>
-<p:properties xmlns:p="http://schemas.microsoft.com/office/2006/metadata/properties" xmlns:xsi="http://www.w3.org/2001/XMLSchema-instance" xmlns:pc="http://schemas.microsoft.com/office/infopath/2007/PartnerControls">
-  <documentManagement>
-    <lcf76f155ced4ddcb4097134ff3c332f xmlns="fb9baec7-83a9-42ee-aa4e-a946a28a9d95">
-      <Terms xmlns="http://schemas.microsoft.com/office/infopath/2007/PartnerControls"/>
-    </lcf76f155ced4ddcb4097134ff3c332f>
-    <TaxCatchAll xmlns="d479cc6d-cf6a-4b72-9469-d0628568ef88" xsi:nil="true"/>
-  </documentManagement>
-</p:properties>
-</file>
-
-<file path=customXml/item2.xml><?xml version="1.0" encoding="utf-8"?>
 <ct:contentTypeSchema xmlns:ct="http://schemas.microsoft.com/office/2006/metadata/contentType" xmlns:ma="http://schemas.microsoft.com/office/2006/metadata/properties/metaAttributes" ct:_="" ma:_="" ma:contentTypeName="Document" ma:contentTypeID="0x0101007F9EF17FC6D4A940959503737C7076B7" ma:contentTypeVersion="14" ma:contentTypeDescription="Create a new document." ma:contentTypeScope="" ma:versionID="7a8717e78fc26d75514854e923b10bfa">
   <xsd:schema xmlns:xsd="http://www.w3.org/2001/XMLSchema" xmlns:xs="http://www.w3.org/2001/XMLSchema" xmlns:p="http://schemas.microsoft.com/office/2006/metadata/properties" xmlns:ns2="fb9baec7-83a9-42ee-aa4e-a946a28a9d95" xmlns:ns3="d479cc6d-cf6a-4b72-9469-d0628568ef88" targetNamespace="http://schemas.microsoft.com/office/2006/metadata/properties" ma:root="true" ma:fieldsID="2d049d9879153fdf38132b2e2c5246fd" ns2:_="" ns3:_="">
     <xsd:import namespace="fb9baec7-83a9-42ee-aa4e-a946a28a9d95"/>
@@ -13021,6 +13162,17 @@
 </ct:contentTypeSchema>
 </file>
 
+<file path=customXml/item2.xml><?xml version="1.0" encoding="utf-8"?>
+<p:properties xmlns:p="http://schemas.microsoft.com/office/2006/metadata/properties" xmlns:xsi="http://www.w3.org/2001/XMLSchema-instance" xmlns:pc="http://schemas.microsoft.com/office/infopath/2007/PartnerControls">
+  <documentManagement>
+    <lcf76f155ced4ddcb4097134ff3c332f xmlns="fb9baec7-83a9-42ee-aa4e-a946a28a9d95">
+      <Terms xmlns="http://schemas.microsoft.com/office/infopath/2007/PartnerControls"/>
+    </lcf76f155ced4ddcb4097134ff3c332f>
+    <TaxCatchAll xmlns="d479cc6d-cf6a-4b72-9469-d0628568ef88" xsi:nil="true"/>
+  </documentManagement>
+</p:properties>
+</file>
+
 <file path=customXml/item3.xml><?xml version="1.0" encoding="utf-8"?>
 <?mso-contentType ?>
 <FormTemplates xmlns="http://schemas.microsoft.com/sharepoint/v3/contenttype/forms">
@@ -13031,17 +13183,6 @@
 </file>
 
 <file path=customXml/itemProps1.xml><?xml version="1.0" encoding="utf-8"?>
-<ds:datastoreItem xmlns:ds="http://schemas.openxmlformats.org/officeDocument/2006/customXml" ds:itemID="{CF607E43-C6C9-4B57-ACD0-73725D551F74}">
-  <ds:schemaRefs>
-    <ds:schemaRef ds:uri="http://schemas.microsoft.com/office/2006/metadata/properties"/>
-    <ds:schemaRef ds:uri="http://schemas.microsoft.com/office/infopath/2007/PartnerControls"/>
-    <ds:schemaRef ds:uri="fb9baec7-83a9-42ee-aa4e-a946a28a9d95"/>
-    <ds:schemaRef ds:uri="d479cc6d-cf6a-4b72-9469-d0628568ef88"/>
-  </ds:schemaRefs>
-</ds:datastoreItem>
-</file>
-
-<file path=customXml/itemProps2.xml><?xml version="1.0" encoding="utf-8"?>
 <ds:datastoreItem xmlns:ds="http://schemas.openxmlformats.org/officeDocument/2006/customXml" ds:itemID="{13175134-1658-4F01-89A9-232C09CB12F1}">
   <ds:schemaRefs>
     <ds:schemaRef ds:uri="http://schemas.microsoft.com/office/2006/metadata/contentType"/>
@@ -13060,6 +13201,17 @@
 </ds:datastoreItem>
 </file>
 
+<file path=customXml/itemProps2.xml><?xml version="1.0" encoding="utf-8"?>
+<ds:datastoreItem xmlns:ds="http://schemas.openxmlformats.org/officeDocument/2006/customXml" ds:itemID="{CF607E43-C6C9-4B57-ACD0-73725D551F74}">
+  <ds:schemaRefs>
+    <ds:schemaRef ds:uri="http://schemas.microsoft.com/office/2006/metadata/properties"/>
+    <ds:schemaRef ds:uri="http://schemas.microsoft.com/office/infopath/2007/PartnerControls"/>
+    <ds:schemaRef ds:uri="fb9baec7-83a9-42ee-aa4e-a946a28a9d95"/>
+    <ds:schemaRef ds:uri="d479cc6d-cf6a-4b72-9469-d0628568ef88"/>
+  </ds:schemaRefs>
+</ds:datastoreItem>
+</file>
+
 <file path=customXml/itemProps3.xml><?xml version="1.0" encoding="utf-8"?>
 <ds:datastoreItem xmlns:ds="http://schemas.openxmlformats.org/officeDocument/2006/customXml" ds:itemID="{07F2C2B2-CBD4-4F76-87B4-F6360215CC70}">
   <ds:schemaRefs>

</xml_diff>